<commit_message>
fix(bendahara): hilangkan ketergantungan class DOMDocument agar ekspor Word berjalan mulus di server cPanel tanpa ekstensi php-dom
</commit_message>
<xml_diff>
--- a/LAPORAN BUKU KAS.docx
+++ b/LAPORAN BUKU KAS.docx
@@ -1,8 +1,8 @@
 
 <file path=word/document.xml><?xml version="1.0" encoding="utf-8"?>
-<w:document xmlns:wpc="http://schemas.microsoft.com/office/word/2010/wordprocessingCanvas" xmlns:cx="http://schemas.microsoft.com/office/drawing/2014/chartex" xmlns:cx1="http://schemas.microsoft.com/office/drawing/2015/9/8/chartex" xmlns:cx2="http://schemas.microsoft.com/office/drawing/2015/10/21/chartex" xmlns:cx3="http://schemas.microsoft.com/office/drawing/2016/5/9/chartex" xmlns:cx4="http://schemas.microsoft.com/office/drawing/2016/5/10/chartex" xmlns:cx5="http://schemas.microsoft.com/office/drawing/2016/5/11/chartex" xmlns:cx6="http://schemas.microsoft.com/office/drawing/2016/5/12/chartex" xmlns:cx7="http://schemas.microsoft.com/office/drawing/2016/5/13/chartex" xmlns:cx8="http://schemas.microsoft.com/office/drawing/2016/5/14/chartex" xmlns:mc="http://schemas.openxmlformats.org/markup-compatibility/2006" xmlns:aink="http://schemas.microsoft.com/office/drawing/2016/ink" xmlns:am3d="http://schemas.microsoft.com/office/drawing/2017/model3d" xmlns:o="urn:schemas-microsoft-com:office:office" xmlns:oel="http://schemas.microsoft.com/office/2019/extlst" xmlns:r="http://schemas.openxmlformats.org/officeDocument/2006/relationships" xmlns:m="http://schemas.openxmlformats.org/officeDocument/2006/math" xmlns:v="urn:schemas-microsoft-com:vml" xmlns:wp14="http://schemas.microsoft.com/office/word/2010/wordprocessingDrawing" xmlns:wp="http://schemas.openxmlformats.org/drawingml/2006/wordprocessingDrawing" xmlns:w10="urn:schemas-microsoft-com:office:word" xmlns:w="http://schemas.openxmlformats.org/wordprocessingml/2006/main" xmlns:w14="http://schemas.microsoft.com/office/word/2010/wordml" xmlns:w15="http://schemas.microsoft.com/office/word/2012/wordml" xmlns:w16cex="http://schemas.microsoft.com/office/word/2018/wordml/cex" xmlns:w16cid="http://schemas.microsoft.com/office/word/2016/wordml/cid" xmlns:w16="http://schemas.microsoft.com/office/word/2018/wordml" xmlns:w16du="http://schemas.microsoft.com/office/word/2023/wordml/word16du" xmlns:w16sdtdh="http://schemas.microsoft.com/office/word/2020/wordml/sdtdatahash" xmlns:w16sdtfl="http://schemas.microsoft.com/office/word/2024/wordml/sdtformatlock" xmlns:w16se="http://schemas.microsoft.com/office/word/2015/wordml/symex" xmlns:wpg="http://schemas.microsoft.com/office/word/2010/wordprocessingGroup" xmlns:wpi="http://schemas.microsoft.com/office/word/2010/wordprocessingInk" xmlns:wne="http://schemas.microsoft.com/office/word/2006/wordml" xmlns:wps="http://schemas.microsoft.com/office/word/2010/wordprocessingShape" mc:Ignorable="w14 w15 w16se w16cid w16 w16cex w16sdtdh w16sdtfl w16du wp14">
+<w:document xmlns:ns1="http://schemas.openxmlformats.org/markup-compatibility/2006" xmlns:ns2="http://schemas.microsoft.com/office/word/2010/wordml" xmlns:w="http://schemas.openxmlformats.org/wordprocessingml/2006/main" ns1:Ignorable="w14 w15 w16se w16cid w16 w16cex w16sdtdh w16sdtfl w16du wp14">
   <w:body>
-    <w:p>
+    <w:p ns2:paraId="7EE84E2E" ns2:textId="70632274">
       <w:pPr>
         <w:spacing w:after="0"/>
         <w:jc w:val="center"/>
@@ -25,7 +25,7 @@
         <w:t>LAPORAN BUKU KAS</w:t>
       </w:r>
     </w:p>
-    <w:p>
+    <w:p ns2:paraId="409A1094" ns2:textId="25179430">
       <w:pPr>
         <w:spacing w:after="0"/>
         <w:jc w:val="center"/>
@@ -48,7 +48,7 @@
         <w:t>PONDOK PESANTREN AL-FALAH PUTRA</w:t>
       </w:r>
     </w:p>
-    <w:p>
+    <w:p ns2:paraId="1941554A" ns2:textId="56793DEC">
       <w:pPr>
         <w:spacing w:before="120" w:after="0"/>
         <w:jc w:val="center"/>
@@ -58,70 +58,21 @@
           <w:bCs/>
         </w:rPr>
       </w:pPr>
-      <w:r>
-        <w:rPr>
-          <w:rFonts w:asciiTheme="minorBidi" w:hAnsiTheme="minorBidi"/>
-          <w:b/>
-          <w:bCs/>
-        </w:rPr>
-        <w:t>PERIODE :{</w:t>
-      </w:r>
       <w:proofErr w:type="spellStart"/>
-      <w:r>
-        <w:rPr>
-          <w:rFonts w:asciiTheme="minorBidi" w:hAnsiTheme="minorBidi"/>
-          <w:b/>
-          <w:bCs/>
-        </w:rPr>
-        <w:t>tanggal_mulai</w:t>
-      </w:r>
+      <w:proofErr w:type="spellEnd"/>
+      <w:proofErr w:type="spellStart"/>
+      <w:proofErr w:type="spellEnd"/>
+      <w:proofErr w:type="spellStart"/>
       <w:proofErr w:type="spellEnd"/>
       <w:r>
         <w:rPr>
           <w:rFonts w:asciiTheme="minorBidi" w:hAnsiTheme="minorBidi"/>
           <w:b/>
-          <w:bCs/>
         </w:rPr>
-        <w:t xml:space="preserve">} </w:t>
-      </w:r>
-      <w:proofErr w:type="spellStart"/>
-      <w:r>
-        <w:rPr>
-          <w:rFonts w:asciiTheme="minorBidi" w:hAnsiTheme="minorBidi"/>
-          <w:b/>
-          <w:bCs/>
-        </w:rPr>
-        <w:t>s.d</w:t>
-      </w:r>
-      <w:proofErr w:type="spellEnd"/>
-      <w:r>
-        <w:rPr>
-          <w:rFonts w:asciiTheme="minorBidi" w:hAnsiTheme="minorBidi"/>
-          <w:b/>
-          <w:bCs/>
-        </w:rPr>
-        <w:t xml:space="preserve"> {</w:t>
-      </w:r>
-      <w:proofErr w:type="spellStart"/>
-      <w:r>
-        <w:rPr>
-          <w:rFonts w:asciiTheme="minorBidi" w:hAnsiTheme="minorBidi"/>
-          <w:b/>
-          <w:bCs/>
-        </w:rPr>
-        <w:t>tanggal_akhir</w:t>
-      </w:r>
-      <w:proofErr w:type="spellEnd"/>
-      <w:r>
-        <w:rPr>
-          <w:rFonts w:asciiTheme="minorBidi" w:hAnsiTheme="minorBidi"/>
-          <w:b/>
-          <w:bCs/>
-        </w:rPr>
-        <w:t>}</w:t>
+        <w:t>PERIODE : {tanggal_mulai} s.d. {tanggal_akhir}</w:t>
       </w:r>
     </w:p>
-    <w:p>
+    <w:p ns2:paraId="2B05672D" ns2:textId="77777777">
       <w:pPr>
         <w:spacing w:before="120" w:after="0"/>
         <w:jc w:val="center"/>
@@ -137,6 +88,14 @@
         <w:tblStyle w:val="KisiTabel"/>
         <w:tblW w:w="5000" w:type="pct"/>
         <w:tblLook w:val="04A0" w:firstRow="1" w:lastRow="0" w:firstColumn="1" w:lastColumn="0" w:noHBand="0" w:noVBand="1"/>
+        <w:tblBorders>
+          <w:top w:val="single" w:sz="6" w:space="0" w:color="000000"/>
+          <w:left w:val="single" w:sz="6" w:space="0" w:color="000000"/>
+          <w:bottom w:val="single" w:sz="6" w:space="0" w:color="000000"/>
+          <w:right w:val="single" w:sz="6" w:space="0" w:color="000000"/>
+          <w:insideH w:val="single" w:sz="6" w:space="0" w:color="000000"/>
+          <w:insideV w:val="single" w:sz="6" w:space="0" w:color="000000"/>
+        </w:tblBorders>
       </w:tblPr>
       <w:tblGrid>
         <w:gridCol w:w="790"/>
@@ -146,7 +105,7 @@
         <w:gridCol w:w="2485"/>
         <w:gridCol w:w="2824"/>
       </w:tblGrid>
-      <w:tr>
+      <w:tr ns2:paraId="5C105BD1" ns2:textId="77777777">
         <w:trPr>
           <w:trHeight w:val="510"/>
         </w:trPr>
@@ -154,8 +113,14 @@
           <w:tcPr>
             <w:tcW w:w="229" w:type="pct"/>
             <w:vAlign w:val="center"/>
-          </w:tcPr>
-          <w:p>
+            <w:tcBorders>
+              <w:top w:val="single" w:sz="6" w:space="0" w:color="000000"/>
+              <w:left w:val="single" w:sz="6" w:space="0" w:color="000000"/>
+              <w:bottom w:val="single" w:sz="6" w:space="0" w:color="000000"/>
+              <w:right w:val="single" w:sz="6" w:space="0" w:color="000000"/>
+            </w:tcBorders>
+          </w:tcPr>
+          <w:p ns2:paraId="0392C3F2" ns2:textId="31283FD9">
             <w:pPr>
               <w:jc w:val="center"/>
               <w:rPr>
@@ -178,8 +143,14 @@
           <w:tcPr>
             <w:tcW w:w="865" w:type="pct"/>
             <w:vAlign w:val="center"/>
-          </w:tcPr>
-          <w:p>
+            <w:tcBorders>
+              <w:top w:val="single" w:sz="6" w:space="0" w:color="000000"/>
+              <w:left w:val="single" w:sz="6" w:space="0" w:color="000000"/>
+              <w:bottom w:val="single" w:sz="6" w:space="0" w:color="000000"/>
+              <w:right w:val="single" w:sz="6" w:space="0" w:color="000000"/>
+            </w:tcBorders>
+          </w:tcPr>
+          <w:p ns2:paraId="3073C324" ns2:textId="47504ABC">
             <w:pPr>
               <w:jc w:val="center"/>
               <w:rPr>
@@ -202,8 +173,14 @@
           <w:tcPr>
             <w:tcW w:w="1513" w:type="pct"/>
             <w:vAlign w:val="center"/>
-          </w:tcPr>
-          <w:p>
+            <w:tcBorders>
+              <w:top w:val="single" w:sz="6" w:space="0" w:color="000000"/>
+              <w:left w:val="single" w:sz="6" w:space="0" w:color="000000"/>
+              <w:bottom w:val="single" w:sz="6" w:space="0" w:color="000000"/>
+              <w:right w:val="single" w:sz="6" w:space="0" w:color="000000"/>
+            </w:tcBorders>
+          </w:tcPr>
+          <w:p ns2:paraId="64121B6A" ns2:textId="4D4D5C1D">
             <w:pPr>
               <w:jc w:val="center"/>
               <w:rPr>
@@ -226,8 +203,14 @@
           <w:tcPr>
             <w:tcW w:w="855" w:type="pct"/>
             <w:vAlign w:val="center"/>
-          </w:tcPr>
-          <w:p>
+            <w:tcBorders>
+              <w:top w:val="single" w:sz="6" w:space="0" w:color="000000"/>
+              <w:left w:val="single" w:sz="6" w:space="0" w:color="000000"/>
+              <w:bottom w:val="single" w:sz="6" w:space="0" w:color="000000"/>
+              <w:right w:val="single" w:sz="6" w:space="0" w:color="000000"/>
+            </w:tcBorders>
+          </w:tcPr>
+          <w:p ns2:paraId="25B29491" ns2:textId="7CBDF985">
             <w:pPr>
               <w:jc w:val="center"/>
               <w:rPr>
@@ -250,8 +233,14 @@
           <w:tcPr>
             <w:tcW w:w="720" w:type="pct"/>
             <w:vAlign w:val="center"/>
-          </w:tcPr>
-          <w:p>
+            <w:tcBorders>
+              <w:top w:val="single" w:sz="6" w:space="0" w:color="000000"/>
+              <w:left w:val="single" w:sz="6" w:space="0" w:color="000000"/>
+              <w:bottom w:val="single" w:sz="6" w:space="0" w:color="000000"/>
+              <w:right w:val="single" w:sz="6" w:space="0" w:color="000000"/>
+            </w:tcBorders>
+          </w:tcPr>
+          <w:p ns2:paraId="4EFA3719" ns2:textId="36A969CB">
             <w:pPr>
               <w:jc w:val="center"/>
               <w:rPr>
@@ -274,8 +263,14 @@
           <w:tcPr>
             <w:tcW w:w="818" w:type="pct"/>
             <w:vAlign w:val="center"/>
-          </w:tcPr>
-          <w:p>
+            <w:tcBorders>
+              <w:top w:val="single" w:sz="6" w:space="0" w:color="000000"/>
+              <w:left w:val="single" w:sz="6" w:space="0" w:color="000000"/>
+              <w:bottom w:val="single" w:sz="6" w:space="0" w:color="000000"/>
+              <w:right w:val="single" w:sz="6" w:space="0" w:color="000000"/>
+            </w:tcBorders>
+          </w:tcPr>
+          <w:p ns2:paraId="70208B4D" ns2:textId="1F199D34">
             <w:pPr>
               <w:jc w:val="center"/>
               <w:rPr>
@@ -295,7 +290,7 @@
           </w:p>
         </w:tc>
       </w:tr>
-      <w:tr>
+      <w:tr ns2:paraId="0CAB66D6" ns2:textId="77777777">
         <w:trPr>
           <w:trHeight w:val="510"/>
         </w:trPr>
@@ -303,8 +298,14 @@
           <w:tcPr>
             <w:tcW w:w="229" w:type="pct"/>
             <w:vAlign w:val="center"/>
-          </w:tcPr>
-          <w:p>
+            <w:tcBorders>
+              <w:top w:val="single" w:sz="6" w:space="0" w:color="000000"/>
+              <w:left w:val="single" w:sz="6" w:space="0" w:color="000000"/>
+              <w:bottom w:val="single" w:sz="6" w:space="0" w:color="000000"/>
+              <w:right w:val="single" w:sz="6" w:space="0" w:color="000000"/>
+            </w:tcBorders>
+          </w:tcPr>
+          <w:p ns2:paraId="6B1E2DFD" ns2:textId="100DE525">
             <w:pPr>
               <w:jc w:val="center"/>
               <w:rPr>
@@ -317,7 +318,6 @@
               <w:rPr>
                 <w:rFonts w:asciiTheme="minorBidi" w:hAnsiTheme="minorBidi"/>
                 <w:b/>
-                <w:bCs/>
               </w:rPr>
               <w:t>{No.}</w:t>
             </w:r>
@@ -327,41 +327,30 @@
           <w:tcPr>
             <w:tcW w:w="865" w:type="pct"/>
             <w:vAlign w:val="center"/>
-          </w:tcPr>
-          <w:p>
-            <w:pPr>
-              <w:jc w:val="center"/>
-              <w:rPr>
-                <w:rFonts w:asciiTheme="minorBidi" w:hAnsiTheme="minorBidi"/>
-                <w:b/>
-                <w:bCs/>
-              </w:rPr>
-            </w:pPr>
-            <w:r>
-              <w:rPr>
-                <w:rFonts w:asciiTheme="minorBidi" w:hAnsiTheme="minorBidi"/>
-                <w:b/>
-                <w:bCs/>
-              </w:rPr>
-              <w:t>{</w:t>
-            </w:r>
+            <w:tcBorders>
+              <w:top w:val="single" w:sz="6" w:space="0" w:color="000000"/>
+              <w:left w:val="single" w:sz="6" w:space="0" w:color="000000"/>
+              <w:bottom w:val="single" w:sz="6" w:space="0" w:color="000000"/>
+              <w:right w:val="single" w:sz="6" w:space="0" w:color="000000"/>
+            </w:tcBorders>
+          </w:tcPr>
+          <w:p ns2:paraId="7FD727C3" ns2:textId="1B818271">
+            <w:pPr>
+              <w:jc w:val="center"/>
+              <w:rPr>
+                <w:rFonts w:asciiTheme="minorBidi" w:hAnsiTheme="minorBidi"/>
+                <w:b/>
+                <w:bCs/>
+              </w:rPr>
+            </w:pPr>
             <w:proofErr w:type="spellStart"/>
-            <w:r>
-              <w:rPr>
-                <w:rFonts w:asciiTheme="minorBidi" w:hAnsiTheme="minorBidi"/>
-                <w:b/>
-                <w:bCs/>
-              </w:rPr>
-              <w:t>No._bukti</w:t>
-            </w:r>
             <w:proofErr w:type="spellEnd"/>
             <w:r>
               <w:rPr>
                 <w:rFonts w:asciiTheme="minorBidi" w:hAnsiTheme="minorBidi"/>
                 <w:b/>
-                <w:bCs/>
-              </w:rPr>
-              <w:t>)</w:t>
+              </w:rPr>
+              <w:t>{No._bukti}</w:t>
             </w:r>
           </w:p>
         </w:tc>
@@ -369,8 +358,14 @@
           <w:tcPr>
             <w:tcW w:w="1513" w:type="pct"/>
             <w:vAlign w:val="center"/>
-          </w:tcPr>
-          <w:p>
+            <w:tcBorders>
+              <w:top w:val="single" w:sz="6" w:space="0" w:color="000000"/>
+              <w:left w:val="single" w:sz="6" w:space="0" w:color="000000"/>
+              <w:bottom w:val="single" w:sz="6" w:space="0" w:color="000000"/>
+              <w:right w:val="single" w:sz="6" w:space="0" w:color="000000"/>
+            </w:tcBorders>
+          </w:tcPr>
+          <w:p ns2:paraId="7C1D508F" ns2:textId="453107DB">
             <w:pPr>
               <w:jc w:val="center"/>
               <w:rPr>
@@ -383,7 +378,6 @@
               <w:rPr>
                 <w:rFonts w:asciiTheme="minorBidi" w:hAnsiTheme="minorBidi"/>
                 <w:b/>
-                <w:bCs/>
               </w:rPr>
               <w:t>{akun}</w:t>
             </w:r>
@@ -393,8 +387,14 @@
           <w:tcPr>
             <w:tcW w:w="855" w:type="pct"/>
             <w:vAlign w:val="center"/>
-          </w:tcPr>
-          <w:p>
+            <w:tcBorders>
+              <w:top w:val="single" w:sz="6" w:space="0" w:color="000000"/>
+              <w:left w:val="single" w:sz="6" w:space="0" w:color="000000"/>
+              <w:bottom w:val="single" w:sz="6" w:space="0" w:color="000000"/>
+              <w:right w:val="single" w:sz="6" w:space="0" w:color="000000"/>
+            </w:tcBorders>
+          </w:tcPr>
+          <w:p ns2:paraId="0BA86D5F" ns2:textId="45C0C516">
             <w:pPr>
               <w:jc w:val="center"/>
               <w:rPr>
@@ -407,7 +407,6 @@
               <w:rPr>
                 <w:rFonts w:asciiTheme="minorBidi" w:hAnsiTheme="minorBidi"/>
                 <w:b/>
-                <w:bCs/>
               </w:rPr>
               <w:t>{debit}</w:t>
             </w:r>
@@ -417,8 +416,14 @@
           <w:tcPr>
             <w:tcW w:w="720" w:type="pct"/>
             <w:vAlign w:val="center"/>
-          </w:tcPr>
-          <w:p>
+            <w:tcBorders>
+              <w:top w:val="single" w:sz="6" w:space="0" w:color="000000"/>
+              <w:left w:val="single" w:sz="6" w:space="0" w:color="000000"/>
+              <w:bottom w:val="single" w:sz="6" w:space="0" w:color="000000"/>
+              <w:right w:val="single" w:sz="6" w:space="0" w:color="000000"/>
+            </w:tcBorders>
+          </w:tcPr>
+          <w:p ns2:paraId="57788CE2" ns2:textId="735FA3C7">
             <w:pPr>
               <w:jc w:val="center"/>
               <w:rPr>
@@ -431,7 +436,6 @@
               <w:rPr>
                 <w:rFonts w:asciiTheme="minorBidi" w:hAnsiTheme="minorBidi"/>
                 <w:b/>
-                <w:bCs/>
               </w:rPr>
               <w:t>{kredit}</w:t>
             </w:r>
@@ -441,8 +445,14 @@
           <w:tcPr>
             <w:tcW w:w="818" w:type="pct"/>
             <w:vAlign w:val="center"/>
-          </w:tcPr>
-          <w:p>
+            <w:tcBorders>
+              <w:top w:val="single" w:sz="6" w:space="0" w:color="000000"/>
+              <w:left w:val="single" w:sz="6" w:space="0" w:color="000000"/>
+              <w:bottom w:val="single" w:sz="6" w:space="0" w:color="000000"/>
+              <w:right w:val="single" w:sz="6" w:space="0" w:color="000000"/>
+            </w:tcBorders>
+          </w:tcPr>
+          <w:p ns2:paraId="46C19CDB" ns2:textId="169F3722">
             <w:pPr>
               <w:jc w:val="center"/>
               <w:rPr>
@@ -455,14 +465,13 @@
               <w:rPr>
                 <w:rFonts w:asciiTheme="minorBidi" w:hAnsiTheme="minorBidi"/>
                 <w:b/>
-                <w:bCs/>
               </w:rPr>
               <w:t>{saldo}</w:t>
             </w:r>
           </w:p>
         </w:tc>
       </w:tr>
-      <w:tr>
+      <w:tr ns2:paraId="40C5DCEC" ns2:textId="77777777">
         <w:trPr>
           <w:trHeight w:val="510"/>
         </w:trPr>
@@ -470,8 +479,14 @@
           <w:tcPr>
             <w:tcW w:w="229" w:type="pct"/>
             <w:vAlign w:val="center"/>
-          </w:tcPr>
-          <w:p>
+            <w:tcBorders>
+              <w:top w:val="single" w:sz="6" w:space="0" w:color="000000"/>
+              <w:left w:val="single" w:sz="6" w:space="0" w:color="000000"/>
+              <w:bottom w:val="single" w:sz="6" w:space="0" w:color="000000"/>
+              <w:right w:val="single" w:sz="6" w:space="0" w:color="000000"/>
+            </w:tcBorders>
+          </w:tcPr>
+          <w:p ns2:paraId="4A78413F" ns2:textId="77777777">
             <w:pPr>
               <w:jc w:val="center"/>
               <w:rPr>
@@ -486,8 +501,14 @@
           <w:tcPr>
             <w:tcW w:w="865" w:type="pct"/>
             <w:vAlign w:val="center"/>
-          </w:tcPr>
-          <w:p>
+            <w:tcBorders>
+              <w:top w:val="single" w:sz="6" w:space="0" w:color="000000"/>
+              <w:left w:val="single" w:sz="6" w:space="0" w:color="000000"/>
+              <w:bottom w:val="single" w:sz="6" w:space="0" w:color="000000"/>
+              <w:right w:val="single" w:sz="6" w:space="0" w:color="000000"/>
+            </w:tcBorders>
+          </w:tcPr>
+          <w:p ns2:paraId="026BFA89" ns2:textId="77777777">
             <w:pPr>
               <w:jc w:val="center"/>
               <w:rPr>
@@ -502,8 +523,14 @@
           <w:tcPr>
             <w:tcW w:w="1513" w:type="pct"/>
             <w:vAlign w:val="center"/>
-          </w:tcPr>
-          <w:p>
+            <w:tcBorders>
+              <w:top w:val="single" w:sz="6" w:space="0" w:color="000000"/>
+              <w:left w:val="single" w:sz="6" w:space="0" w:color="000000"/>
+              <w:bottom w:val="single" w:sz="6" w:space="0" w:color="000000"/>
+              <w:right w:val="single" w:sz="6" w:space="0" w:color="000000"/>
+            </w:tcBorders>
+          </w:tcPr>
+          <w:p ns2:paraId="03771BC9" ns2:textId="77777777">
             <w:pPr>
               <w:jc w:val="center"/>
               <w:rPr>
@@ -518,8 +545,14 @@
           <w:tcPr>
             <w:tcW w:w="855" w:type="pct"/>
             <w:vAlign w:val="center"/>
-          </w:tcPr>
-          <w:p>
+            <w:tcBorders>
+              <w:top w:val="single" w:sz="6" w:space="0" w:color="000000"/>
+              <w:left w:val="single" w:sz="6" w:space="0" w:color="000000"/>
+              <w:bottom w:val="single" w:sz="6" w:space="0" w:color="000000"/>
+              <w:right w:val="single" w:sz="6" w:space="0" w:color="000000"/>
+            </w:tcBorders>
+          </w:tcPr>
+          <w:p ns2:paraId="0B71A27A" ns2:textId="77777777">
             <w:pPr>
               <w:jc w:val="center"/>
               <w:rPr>
@@ -534,8 +567,14 @@
           <w:tcPr>
             <w:tcW w:w="720" w:type="pct"/>
             <w:vAlign w:val="center"/>
-          </w:tcPr>
-          <w:p>
+            <w:tcBorders>
+              <w:top w:val="single" w:sz="6" w:space="0" w:color="000000"/>
+              <w:left w:val="single" w:sz="6" w:space="0" w:color="000000"/>
+              <w:bottom w:val="single" w:sz="6" w:space="0" w:color="000000"/>
+              <w:right w:val="single" w:sz="6" w:space="0" w:color="000000"/>
+            </w:tcBorders>
+          </w:tcPr>
+          <w:p ns2:paraId="2172CC20" ns2:textId="77777777">
             <w:pPr>
               <w:jc w:val="center"/>
               <w:rPr>
@@ -550,8 +589,14 @@
           <w:tcPr>
             <w:tcW w:w="818" w:type="pct"/>
             <w:vAlign w:val="center"/>
-          </w:tcPr>
-          <w:p>
+            <w:tcBorders>
+              <w:top w:val="single" w:sz="6" w:space="0" w:color="000000"/>
+              <w:left w:val="single" w:sz="6" w:space="0" w:color="000000"/>
+              <w:bottom w:val="single" w:sz="6" w:space="0" w:color="000000"/>
+              <w:right w:val="single" w:sz="6" w:space="0" w:color="000000"/>
+            </w:tcBorders>
+          </w:tcPr>
+          <w:p ns2:paraId="4C0D997B" ns2:textId="77777777">
             <w:pPr>
               <w:jc w:val="center"/>
               <w:rPr>
@@ -563,7 +608,7 @@
           </w:p>
         </w:tc>
       </w:tr>
-      <w:tr>
+      <w:tr ns2:paraId="62635665" ns2:textId="77777777">
         <w:trPr>
           <w:trHeight w:val="510"/>
         </w:trPr>
@@ -571,8 +616,14 @@
           <w:tcPr>
             <w:tcW w:w="229" w:type="pct"/>
             <w:vAlign w:val="center"/>
-          </w:tcPr>
-          <w:p>
+            <w:tcBorders>
+              <w:top w:val="single" w:sz="6" w:space="0" w:color="000000"/>
+              <w:left w:val="single" w:sz="6" w:space="0" w:color="000000"/>
+              <w:bottom w:val="single" w:sz="6" w:space="0" w:color="000000"/>
+              <w:right w:val="single" w:sz="6" w:space="0" w:color="000000"/>
+            </w:tcBorders>
+          </w:tcPr>
+          <w:p ns2:paraId="56B1A096" ns2:textId="77777777">
             <w:pPr>
               <w:jc w:val="center"/>
               <w:rPr>
@@ -587,8 +638,14 @@
           <w:tcPr>
             <w:tcW w:w="865" w:type="pct"/>
             <w:vAlign w:val="center"/>
-          </w:tcPr>
-          <w:p>
+            <w:tcBorders>
+              <w:top w:val="single" w:sz="6" w:space="0" w:color="000000"/>
+              <w:left w:val="single" w:sz="6" w:space="0" w:color="000000"/>
+              <w:bottom w:val="single" w:sz="6" w:space="0" w:color="000000"/>
+              <w:right w:val="single" w:sz="6" w:space="0" w:color="000000"/>
+            </w:tcBorders>
+          </w:tcPr>
+          <w:p ns2:paraId="776A85B6" ns2:textId="77777777">
             <w:pPr>
               <w:jc w:val="center"/>
               <w:rPr>
@@ -603,8 +660,14 @@
           <w:tcPr>
             <w:tcW w:w="1513" w:type="pct"/>
             <w:vAlign w:val="center"/>
-          </w:tcPr>
-          <w:p>
+            <w:tcBorders>
+              <w:top w:val="single" w:sz="6" w:space="0" w:color="000000"/>
+              <w:left w:val="single" w:sz="6" w:space="0" w:color="000000"/>
+              <w:bottom w:val="single" w:sz="6" w:space="0" w:color="000000"/>
+              <w:right w:val="single" w:sz="6" w:space="0" w:color="000000"/>
+            </w:tcBorders>
+          </w:tcPr>
+          <w:p ns2:paraId="4C98948C" ns2:textId="77777777">
             <w:pPr>
               <w:jc w:val="center"/>
               <w:rPr>
@@ -619,8 +682,14 @@
           <w:tcPr>
             <w:tcW w:w="855" w:type="pct"/>
             <w:vAlign w:val="center"/>
-          </w:tcPr>
-          <w:p>
+            <w:tcBorders>
+              <w:top w:val="single" w:sz="6" w:space="0" w:color="000000"/>
+              <w:left w:val="single" w:sz="6" w:space="0" w:color="000000"/>
+              <w:bottom w:val="single" w:sz="6" w:space="0" w:color="000000"/>
+              <w:right w:val="single" w:sz="6" w:space="0" w:color="000000"/>
+            </w:tcBorders>
+          </w:tcPr>
+          <w:p ns2:paraId="14879B66" ns2:textId="77777777">
             <w:pPr>
               <w:jc w:val="center"/>
               <w:rPr>
@@ -635,8 +704,14 @@
           <w:tcPr>
             <w:tcW w:w="720" w:type="pct"/>
             <w:vAlign w:val="center"/>
-          </w:tcPr>
-          <w:p>
+            <w:tcBorders>
+              <w:top w:val="single" w:sz="6" w:space="0" w:color="000000"/>
+              <w:left w:val="single" w:sz="6" w:space="0" w:color="000000"/>
+              <w:bottom w:val="single" w:sz="6" w:space="0" w:color="000000"/>
+              <w:right w:val="single" w:sz="6" w:space="0" w:color="000000"/>
+            </w:tcBorders>
+          </w:tcPr>
+          <w:p ns2:paraId="3161580B" ns2:textId="77777777">
             <w:pPr>
               <w:jc w:val="center"/>
               <w:rPr>
@@ -651,8 +726,14 @@
           <w:tcPr>
             <w:tcW w:w="818" w:type="pct"/>
             <w:vAlign w:val="center"/>
-          </w:tcPr>
-          <w:p>
+            <w:tcBorders>
+              <w:top w:val="single" w:sz="6" w:space="0" w:color="000000"/>
+              <w:left w:val="single" w:sz="6" w:space="0" w:color="000000"/>
+              <w:bottom w:val="single" w:sz="6" w:space="0" w:color="000000"/>
+              <w:right w:val="single" w:sz="6" w:space="0" w:color="000000"/>
+            </w:tcBorders>
+          </w:tcPr>
+          <w:p ns2:paraId="7E7B7C7A" ns2:textId="77777777">
             <w:pPr>
               <w:jc w:val="center"/>
               <w:rPr>
@@ -664,7 +745,7 @@
           </w:p>
         </w:tc>
       </w:tr>
-      <w:tr>
+      <w:tr ns2:paraId="285CE190" ns2:textId="77777777">
         <w:trPr>
           <w:trHeight w:val="510"/>
         </w:trPr>
@@ -672,8 +753,14 @@
           <w:tcPr>
             <w:tcW w:w="229" w:type="pct"/>
             <w:vAlign w:val="center"/>
-          </w:tcPr>
-          <w:p>
+            <w:tcBorders>
+              <w:top w:val="single" w:sz="6" w:space="0" w:color="000000"/>
+              <w:left w:val="single" w:sz="6" w:space="0" w:color="000000"/>
+              <w:bottom w:val="single" w:sz="6" w:space="0" w:color="000000"/>
+              <w:right w:val="single" w:sz="6" w:space="0" w:color="000000"/>
+            </w:tcBorders>
+          </w:tcPr>
+          <w:p ns2:paraId="3C25A149" ns2:textId="77777777">
             <w:pPr>
               <w:jc w:val="center"/>
               <w:rPr>
@@ -689,8 +776,14 @@
             <w:tcW w:w="2378" w:type="pct"/>
             <w:gridSpan w:val="2"/>
             <w:vAlign w:val="center"/>
-          </w:tcPr>
-          <w:p>
+            <w:tcBorders>
+              <w:top w:val="single" w:sz="6" w:space="0" w:color="000000"/>
+              <w:left w:val="single" w:sz="6" w:space="0" w:color="000000"/>
+              <w:bottom w:val="single" w:sz="6" w:space="0" w:color="000000"/>
+              <w:right w:val="single" w:sz="6" w:space="0" w:color="000000"/>
+            </w:tcBorders>
+          </w:tcPr>
+          <w:p ns2:paraId="17F8CA91" ns2:textId="373E9356">
             <w:pPr>
               <w:jc w:val="center"/>
               <w:rPr>
@@ -713,41 +806,30 @@
           <w:tcPr>
             <w:tcW w:w="855" w:type="pct"/>
             <w:vAlign w:val="center"/>
-          </w:tcPr>
-          <w:p>
-            <w:pPr>
-              <w:jc w:val="center"/>
-              <w:rPr>
-                <w:rFonts w:asciiTheme="minorBidi" w:hAnsiTheme="minorBidi"/>
-                <w:b/>
-                <w:bCs/>
-              </w:rPr>
-            </w:pPr>
-            <w:r>
-              <w:rPr>
-                <w:rFonts w:asciiTheme="minorBidi" w:hAnsiTheme="minorBidi"/>
-                <w:b/>
-                <w:bCs/>
-              </w:rPr>
-              <w:t>{</w:t>
-            </w:r>
+            <w:tcBorders>
+              <w:top w:val="single" w:sz="6" w:space="0" w:color="000000"/>
+              <w:left w:val="single" w:sz="6" w:space="0" w:color="000000"/>
+              <w:bottom w:val="single" w:sz="6" w:space="0" w:color="000000"/>
+              <w:right w:val="single" w:sz="6" w:space="0" w:color="000000"/>
+            </w:tcBorders>
+          </w:tcPr>
+          <w:p ns2:paraId="3E7FDAF1" ns2:textId="48D5A487">
+            <w:pPr>
+              <w:jc w:val="center"/>
+              <w:rPr>
+                <w:rFonts w:asciiTheme="minorBidi" w:hAnsiTheme="minorBidi"/>
+                <w:b/>
+                <w:bCs/>
+              </w:rPr>
+            </w:pPr>
             <w:proofErr w:type="spellStart"/>
-            <w:r>
-              <w:rPr>
-                <w:rFonts w:asciiTheme="minorBidi" w:hAnsiTheme="minorBidi"/>
-                <w:b/>
-                <w:bCs/>
-              </w:rPr>
-              <w:t>total_debit</w:t>
-            </w:r>
             <w:proofErr w:type="spellEnd"/>
             <w:r>
               <w:rPr>
                 <w:rFonts w:asciiTheme="minorBidi" w:hAnsiTheme="minorBidi"/>
                 <w:b/>
-                <w:bCs/>
-              </w:rPr>
-              <w:t>}</w:t>
+              </w:rPr>
+              <w:t>{total_debit}</w:t>
             </w:r>
           </w:p>
         </w:tc>
@@ -755,41 +837,30 @@
           <w:tcPr>
             <w:tcW w:w="720" w:type="pct"/>
             <w:vAlign w:val="center"/>
-          </w:tcPr>
-          <w:p>
-            <w:pPr>
-              <w:jc w:val="center"/>
-              <w:rPr>
-                <w:rFonts w:asciiTheme="minorBidi" w:hAnsiTheme="minorBidi"/>
-                <w:b/>
-                <w:bCs/>
-              </w:rPr>
-            </w:pPr>
-            <w:r>
-              <w:rPr>
-                <w:rFonts w:asciiTheme="minorBidi" w:hAnsiTheme="minorBidi"/>
-                <w:b/>
-                <w:bCs/>
-              </w:rPr>
-              <w:t>{</w:t>
-            </w:r>
+            <w:tcBorders>
+              <w:top w:val="single" w:sz="6" w:space="0" w:color="000000"/>
+              <w:left w:val="single" w:sz="6" w:space="0" w:color="000000"/>
+              <w:bottom w:val="single" w:sz="6" w:space="0" w:color="000000"/>
+              <w:right w:val="single" w:sz="6" w:space="0" w:color="000000"/>
+            </w:tcBorders>
+          </w:tcPr>
+          <w:p ns2:paraId="49FF2737" ns2:textId="3E8D7BAC">
+            <w:pPr>
+              <w:jc w:val="center"/>
+              <w:rPr>
+                <w:rFonts w:asciiTheme="minorBidi" w:hAnsiTheme="minorBidi"/>
+                <w:b/>
+                <w:bCs/>
+              </w:rPr>
+            </w:pPr>
             <w:proofErr w:type="spellStart"/>
-            <w:r>
-              <w:rPr>
-                <w:rFonts w:asciiTheme="minorBidi" w:hAnsiTheme="minorBidi"/>
-                <w:b/>
-                <w:bCs/>
-              </w:rPr>
-              <w:t>total_kredit</w:t>
-            </w:r>
             <w:proofErr w:type="spellEnd"/>
             <w:r>
               <w:rPr>
                 <w:rFonts w:asciiTheme="minorBidi" w:hAnsiTheme="minorBidi"/>
                 <w:b/>
-                <w:bCs/>
-              </w:rPr>
-              <w:t>}</w:t>
+              </w:rPr>
+              <w:t>{total_kredit}</w:t>
             </w:r>
           </w:p>
         </w:tc>
@@ -797,8 +868,14 @@
           <w:tcPr>
             <w:tcW w:w="818" w:type="pct"/>
             <w:vAlign w:val="center"/>
-          </w:tcPr>
-          <w:p>
+            <w:tcBorders>
+              <w:top w:val="single" w:sz="6" w:space="0" w:color="000000"/>
+              <w:left w:val="single" w:sz="6" w:space="0" w:color="000000"/>
+              <w:bottom w:val="single" w:sz="6" w:space="0" w:color="000000"/>
+              <w:right w:val="single" w:sz="6" w:space="0" w:color="000000"/>
+            </w:tcBorders>
+          </w:tcPr>
+          <w:p ns2:paraId="5C9056C0" ns2:textId="27EBF9A5">
             <w:pPr>
               <w:jc w:val="center"/>
               <w:rPr>
@@ -811,7 +888,6 @@
               <w:rPr>
                 <w:rFonts w:asciiTheme="minorBidi" w:hAnsiTheme="minorBidi"/>
                 <w:b/>
-                <w:bCs/>
               </w:rPr>
               <w:t>{total_}</w:t>
             </w:r>
@@ -819,7 +895,7 @@
         </w:tc>
       </w:tr>
     </w:tbl>
-    <w:p>
+    <w:p ns2:paraId="72FA88EC" ns2:textId="77777777">
       <w:pPr>
         <w:spacing w:before="120" w:after="0"/>
         <w:jc w:val="center"/>
@@ -830,7 +906,7 @@
         </w:rPr>
       </w:pPr>
     </w:p>
-    <w:p>
+    <w:p ns2:paraId="26BD239A" ns2:textId="77777777">
       <w:pPr>
         <w:spacing w:before="120" w:after="0"/>
         <w:jc w:val="center"/>
@@ -859,7 +935,7 @@
         <w:gridCol w:w="8629"/>
         <w:gridCol w:w="8630"/>
       </w:tblGrid>
-      <w:tr>
+      <w:tr ns2:paraId="52CE0FE8" ns2:textId="77777777">
         <w:trPr>
           <w:trHeight w:val="510"/>
         </w:trPr>
@@ -868,7 +944,7 @@
             <w:tcW w:w="8629" w:type="dxa"/>
             <w:vAlign w:val="center"/>
           </w:tcPr>
-          <w:p>
+          <w:p ns2:paraId="54CFA6E6" ns2:textId="77777777">
             <w:pPr>
               <w:jc w:val="center"/>
               <w:rPr>
@@ -882,7 +958,7 @@
               <w:t>Mengetahui,</w:t>
             </w:r>
           </w:p>
-          <w:p>
+          <w:p ns2:paraId="0BF82711" ns2:textId="77777777">
             <w:pPr>
               <w:jc w:val="center"/>
               <w:rPr>
@@ -896,55 +972,55 @@
               <w:t>Ketua Umum</w:t>
             </w:r>
           </w:p>
-          <w:p>
-            <w:pPr>
-              <w:jc w:val="center"/>
-              <w:rPr>
-                <w:rFonts w:asciiTheme="minorBidi" w:hAnsiTheme="minorBidi"/>
-              </w:rPr>
-            </w:pPr>
-          </w:p>
-          <w:p>
-            <w:pPr>
-              <w:jc w:val="center"/>
-              <w:rPr>
-                <w:rFonts w:asciiTheme="minorBidi" w:hAnsiTheme="minorBidi"/>
-              </w:rPr>
-            </w:pPr>
-          </w:p>
-          <w:p>
-            <w:pPr>
-              <w:jc w:val="center"/>
-              <w:rPr>
-                <w:rFonts w:asciiTheme="minorBidi" w:hAnsiTheme="minorBidi"/>
-              </w:rPr>
-            </w:pPr>
-          </w:p>
-          <w:p>
-            <w:pPr>
-              <w:jc w:val="center"/>
-              <w:rPr>
-                <w:rFonts w:asciiTheme="minorBidi" w:hAnsiTheme="minorBidi"/>
-              </w:rPr>
-            </w:pPr>
-          </w:p>
-          <w:p>
-            <w:pPr>
-              <w:jc w:val="center"/>
-              <w:rPr>
-                <w:rFonts w:asciiTheme="minorBidi" w:hAnsiTheme="minorBidi"/>
-              </w:rPr>
-            </w:pPr>
-          </w:p>
-          <w:p>
-            <w:pPr>
-              <w:jc w:val="center"/>
-              <w:rPr>
-                <w:rFonts w:asciiTheme="minorBidi" w:hAnsiTheme="minorBidi"/>
-              </w:rPr>
-            </w:pPr>
-          </w:p>
-          <w:p>
+          <w:p ns2:paraId="6A153306" ns2:textId="77777777">
+            <w:pPr>
+              <w:jc w:val="center"/>
+              <w:rPr>
+                <w:rFonts w:asciiTheme="minorBidi" w:hAnsiTheme="minorBidi"/>
+              </w:rPr>
+            </w:pPr>
+          </w:p>
+          <w:p ns2:paraId="79C10680" ns2:textId="77777777">
+            <w:pPr>
+              <w:jc w:val="center"/>
+              <w:rPr>
+                <w:rFonts w:asciiTheme="minorBidi" w:hAnsiTheme="minorBidi"/>
+              </w:rPr>
+            </w:pPr>
+          </w:p>
+          <w:p ns2:paraId="4F15C93E" ns2:textId="77777777">
+            <w:pPr>
+              <w:jc w:val="center"/>
+              <w:rPr>
+                <w:rFonts w:asciiTheme="minorBidi" w:hAnsiTheme="minorBidi"/>
+              </w:rPr>
+            </w:pPr>
+          </w:p>
+          <w:p ns2:paraId="6134187D" ns2:textId="77777777">
+            <w:pPr>
+              <w:jc w:val="center"/>
+              <w:rPr>
+                <w:rFonts w:asciiTheme="minorBidi" w:hAnsiTheme="minorBidi"/>
+              </w:rPr>
+            </w:pPr>
+          </w:p>
+          <w:p ns2:paraId="57858850" ns2:textId="77777777">
+            <w:pPr>
+              <w:jc w:val="center"/>
+              <w:rPr>
+                <w:rFonts w:asciiTheme="minorBidi" w:hAnsiTheme="minorBidi"/>
+              </w:rPr>
+            </w:pPr>
+          </w:p>
+          <w:p ns2:paraId="6C5AC5FF" ns2:textId="77777777">
+            <w:pPr>
+              <w:jc w:val="center"/>
+              <w:rPr>
+                <w:rFonts w:asciiTheme="minorBidi" w:hAnsiTheme="minorBidi"/>
+              </w:rPr>
+            </w:pPr>
+          </w:p>
+          <w:p ns2:paraId="7F6DBA06" ns2:textId="58A053BE">
             <w:pPr>
               <w:jc w:val="center"/>
               <w:rPr>
@@ -967,15 +1043,15 @@
           <w:tcPr>
             <w:tcW w:w="8630" w:type="dxa"/>
           </w:tcPr>
-          <w:p>
-            <w:pPr>
-              <w:jc w:val="center"/>
-              <w:rPr>
-                <w:rFonts w:asciiTheme="minorBidi" w:hAnsiTheme="minorBidi"/>
-              </w:rPr>
-            </w:pPr>
-          </w:p>
-          <w:p>
+          <w:p ns2:paraId="7DC5A487" ns2:textId="77777777">
+            <w:pPr>
+              <w:jc w:val="center"/>
+              <w:rPr>
+                <w:rFonts w:asciiTheme="minorBidi" w:hAnsiTheme="minorBidi"/>
+              </w:rPr>
+            </w:pPr>
+          </w:p>
+          <w:p ns2:paraId="6A2121BC" ns2:textId="77777777">
             <w:pPr>
               <w:jc w:val="center"/>
               <w:rPr>
@@ -989,55 +1065,55 @@
               <w:t>Bendahara</w:t>
             </w:r>
           </w:p>
-          <w:p>
-            <w:pPr>
-              <w:jc w:val="center"/>
-              <w:rPr>
-                <w:rFonts w:asciiTheme="minorBidi" w:hAnsiTheme="minorBidi"/>
-              </w:rPr>
-            </w:pPr>
-          </w:p>
-          <w:p>
-            <w:pPr>
-              <w:jc w:val="center"/>
-              <w:rPr>
-                <w:rFonts w:asciiTheme="minorBidi" w:hAnsiTheme="minorBidi"/>
-              </w:rPr>
-            </w:pPr>
-          </w:p>
-          <w:p>
-            <w:pPr>
-              <w:jc w:val="center"/>
-              <w:rPr>
-                <w:rFonts w:asciiTheme="minorBidi" w:hAnsiTheme="minorBidi"/>
-              </w:rPr>
-            </w:pPr>
-          </w:p>
-          <w:p>
-            <w:pPr>
-              <w:jc w:val="center"/>
-              <w:rPr>
-                <w:rFonts w:asciiTheme="minorBidi" w:hAnsiTheme="minorBidi"/>
-              </w:rPr>
-            </w:pPr>
-          </w:p>
-          <w:p>
-            <w:pPr>
-              <w:jc w:val="center"/>
-              <w:rPr>
-                <w:rFonts w:asciiTheme="minorBidi" w:hAnsiTheme="minorBidi"/>
-              </w:rPr>
-            </w:pPr>
-          </w:p>
-          <w:p>
-            <w:pPr>
-              <w:jc w:val="center"/>
-              <w:rPr>
-                <w:rFonts w:asciiTheme="minorBidi" w:hAnsiTheme="minorBidi"/>
-              </w:rPr>
-            </w:pPr>
-          </w:p>
-          <w:p>
+          <w:p ns2:paraId="7A3430C0" ns2:textId="77777777">
+            <w:pPr>
+              <w:jc w:val="center"/>
+              <w:rPr>
+                <w:rFonts w:asciiTheme="minorBidi" w:hAnsiTheme="minorBidi"/>
+              </w:rPr>
+            </w:pPr>
+          </w:p>
+          <w:p ns2:paraId="781C76C4" ns2:textId="77777777">
+            <w:pPr>
+              <w:jc w:val="center"/>
+              <w:rPr>
+                <w:rFonts w:asciiTheme="minorBidi" w:hAnsiTheme="minorBidi"/>
+              </w:rPr>
+            </w:pPr>
+          </w:p>
+          <w:p ns2:paraId="1C964D30" ns2:textId="77777777">
+            <w:pPr>
+              <w:jc w:val="center"/>
+              <w:rPr>
+                <w:rFonts w:asciiTheme="minorBidi" w:hAnsiTheme="minorBidi"/>
+              </w:rPr>
+            </w:pPr>
+          </w:p>
+          <w:p ns2:paraId="41A72579" ns2:textId="77777777">
+            <w:pPr>
+              <w:jc w:val="center"/>
+              <w:rPr>
+                <w:rFonts w:asciiTheme="minorBidi" w:hAnsiTheme="minorBidi"/>
+              </w:rPr>
+            </w:pPr>
+          </w:p>
+          <w:p ns2:paraId="1B446AE8" ns2:textId="77777777">
+            <w:pPr>
+              <w:jc w:val="center"/>
+              <w:rPr>
+                <w:rFonts w:asciiTheme="minorBidi" w:hAnsiTheme="minorBidi"/>
+              </w:rPr>
+            </w:pPr>
+          </w:p>
+          <w:p ns2:paraId="0958CA26" ns2:textId="77777777">
+            <w:pPr>
+              <w:jc w:val="center"/>
+              <w:rPr>
+                <w:rFonts w:asciiTheme="minorBidi" w:hAnsiTheme="minorBidi"/>
+              </w:rPr>
+            </w:pPr>
+          </w:p>
+          <w:p ns2:paraId="2F866B45" ns2:textId="0E90E611">
             <w:pPr>
               <w:jc w:val="center"/>
               <w:rPr>
@@ -1068,7 +1144,7 @@
         </w:tc>
       </w:tr>
     </w:tbl>
-    <w:p>
+    <w:p ns2:paraId="7250F7A5" ns2:textId="77777777">
       <w:pPr>
         <w:spacing w:before="120" w:after="0"/>
         <w:jc w:val="center"/>

</xml_diff>